<commit_message>
Updating the documentation for the application
</commit_message>
<xml_diff>
--- a/AIChatAssist_ProjectDocumentation.docx
+++ b/AIChatAssist_ProjectDocumentation.docx
@@ -16,7 +16,7 @@
         <w:rPr>
           <w:b/>
         </w:rPr>
-        <w:t>This document provides a technical overview of the AI Chat Assist application developed using Next.js, TypeScript, and AI model integrations including Groq and Gemini APIs.</w:t>
+        <w:t>This document provides a technical overview of the AI Chat Assist application developed using Next.js, React, TypeScript, and AI integrations with Groq and Google Gemini.</w:t>
       </w:r>
     </w:p>
     <w:p>
@@ -29,12 +29,12 @@
     </w:p>
     <w:p>
       <w:r>
-        <w:t>AI Chat Assist is a modern AI-powered conversational web application that enables users to interact with AI models in real time through a clean and responsive user interface. The application was designed with a focus on scalability, maintainability, reusable architecture, and production-style frontend engineering practices.</w:t>
+        <w:t>AI Chat Assist is a modern AI-powered chat application designed to provide users with real-time conversational AI interactions using streaming responses similar to mainstream Generative AI products.</w:t>
       </w:r>
     </w:p>
     <w:p>
       <w:r>
-        <w:t>The project integrates multiple AI providers and includes intelligent fallback handling to ensure uninterrupted AI responses during API quota limitations.</w:t>
+        <w:t>The application was developed with a focus on scalability, maintainability, secure API handling, reusable component architecture, responsive design, and production-style frontend engineering practices.</w:t>
       </w:r>
     </w:p>
     <w:p>
@@ -50,7 +50,7 @@
         <w:pStyle w:val="ListBullet"/>
       </w:pPr>
       <w:r>
-        <w:t>Real-time AI conversation interface</w:t>
+        <w:t>Real-time AI chat with streaming responses</w:t>
       </w:r>
     </w:p>
     <w:p>
@@ -58,7 +58,7 @@
         <w:pStyle w:val="ListBullet"/>
       </w:pPr>
       <w:r>
-        <w:t>Groq and Gemini AI provider integration</w:t>
+        <w:t>Multi-conversation sidebar with conversation switching</w:t>
       </w:r>
     </w:p>
     <w:p>
@@ -66,7 +66,7 @@
         <w:pStyle w:val="ListBullet"/>
       </w:pPr>
       <w:r>
-        <w:t>Automatic provider fallback mechanism</w:t>
+        <w:t>Conversation persistence using localStorage</w:t>
       </w:r>
     </w:p>
     <w:p>
@@ -74,7 +74,7 @@
         <w:pStyle w:val="ListBullet"/>
       </w:pPr>
       <w:r>
-        <w:t>Persistent chat history using Local Storage</w:t>
+        <w:t>Dynamic response rendering without page refresh</w:t>
       </w:r>
     </w:p>
     <w:p>
@@ -82,7 +82,7 @@
         <w:pStyle w:val="ListBullet"/>
       </w:pPr>
       <w:r>
-        <w:t>Markdown rendering support</w:t>
+        <w:t>Loading states and user-friendly error handling</w:t>
       </w:r>
     </w:p>
     <w:p>
@@ -90,7 +90,7 @@
         <w:pStyle w:val="ListBullet"/>
       </w:pPr>
       <w:r>
-        <w:t>Code block rendering and copy support</w:t>
+        <w:t>Groq and Google Gemini AI integrations</w:t>
       </w:r>
     </w:p>
     <w:p>
@@ -98,7 +98,7 @@
         <w:pStyle w:val="ListBullet"/>
       </w:pPr>
       <w:r>
-        <w:t>Reusable component-based architecture</w:t>
+        <w:t>Automatic Groq fallback when Gemini quota limits are reached</w:t>
       </w:r>
     </w:p>
     <w:p>
@@ -106,7 +106,7 @@
         <w:pStyle w:val="ListBullet"/>
       </w:pPr>
       <w:r>
-        <w:t>Responsive layout for desktop and mobile devices</w:t>
+        <w:t>Secure server-side API handling using Next.js API routes</w:t>
       </w:r>
     </w:p>
     <w:p>
@@ -114,7 +114,7 @@
         <w:pStyle w:val="ListBullet"/>
       </w:pPr>
       <w:r>
-        <w:t>Loading states and API error handling</w:t>
+        <w:t>Markdown rendering with sanitization support</w:t>
       </w:r>
     </w:p>
     <w:p>
@@ -122,7 +122,7 @@
         <w:pStyle w:val="ListBullet"/>
       </w:pPr>
       <w:r>
-        <w:t>Session management and chat clearing functionality</w:t>
+        <w:t>Copy message and copy code block functionality</w:t>
       </w:r>
     </w:p>
     <w:p>
@@ -130,7 +130,23 @@
         <w:pStyle w:val="ListBullet"/>
       </w:pPr>
       <w:r>
-        <w:t>Unit testing implementation</w:t>
+        <w:t>Edit and resend user messages</w:t>
+      </w:r>
+    </w:p>
+    <w:p>
+      <w:pPr>
+        <w:pStyle w:val="ListBullet"/>
+      </w:pPr>
+      <w:r>
+        <w:t>Responsive mobile and desktop layouts</w:t>
+      </w:r>
+    </w:p>
+    <w:p>
+      <w:pPr>
+        <w:pStyle w:val="ListBullet"/>
+      </w:pPr>
+      <w:r>
+        <w:t>Unit testing using Vitest and React Testing Library</w:t>
       </w:r>
     </w:p>
     <w:p>
@@ -180,7 +196,7 @@
           </w:tcPr>
           <w:p>
             <w:r>
-              <w:t>Next.js</w:t>
+              <w:t>Next.js 16</w:t>
             </w:r>
           </w:p>
         </w:tc>
@@ -190,7 +206,7 @@
           </w:tcPr>
           <w:p>
             <w:r>
-              <w:t>Frontend framework</w:t>
+              <w:t>Frontend framework and API routes</w:t>
             </w:r>
           </w:p>
         </w:tc>
@@ -202,7 +218,7 @@
           </w:tcPr>
           <w:p>
             <w:r>
-              <w:t>React</w:t>
+              <w:t>React 19</w:t>
             </w:r>
           </w:p>
         </w:tc>
@@ -212,7 +228,7 @@
           </w:tcPr>
           <w:p>
             <w:r>
-              <w:t>UI library</w:t>
+              <w:t>Custom UI components</w:t>
             </w:r>
           </w:p>
         </w:tc>
@@ -246,7 +262,7 @@
           </w:tcPr>
           <w:p>
             <w:r>
-              <w:t>Tailwind CSS</w:t>
+              <w:t>Tailwind CSS 4</w:t>
             </w:r>
           </w:p>
         </w:tc>
@@ -256,7 +272,7 @@
           </w:tcPr>
           <w:p>
             <w:r>
-              <w:t>Application styling</w:t>
+              <w:t>Responsive styling</w:t>
             </w:r>
           </w:p>
         </w:tc>
@@ -278,7 +294,7 @@
           </w:tcPr>
           <w:p>
             <w:r>
-              <w:t>AI model integration</w:t>
+              <w:t>AI provider integration</w:t>
             </w:r>
           </w:p>
         </w:tc>
@@ -290,7 +306,7 @@
           </w:tcPr>
           <w:p>
             <w:r>
-              <w:t>Gemini API</w:t>
+              <w:t>Google Gemini API</w:t>
             </w:r>
           </w:p>
         </w:tc>
@@ -300,7 +316,7 @@
           </w:tcPr>
           <w:p>
             <w:r>
-              <w:t>AI model integration</w:t>
+              <w:t>AI provider integration</w:t>
             </w:r>
           </w:p>
         </w:tc>
@@ -312,7 +328,7 @@
           </w:tcPr>
           <w:p>
             <w:r>
-              <w:t>React Markdown</w:t>
+              <w:t>react-markdown</w:t>
             </w:r>
           </w:p>
         </w:tc>
@@ -334,7 +350,51 @@
           </w:tcPr>
           <w:p>
             <w:r>
-              <w:t>Jest / Testing Library</w:t>
+              <w:t>remark-gfm + rehype-sanitize</w:t>
+            </w:r>
+          </w:p>
+        </w:tc>
+        <w:tc>
+          <w:tcPr>
+            <w:tcW w:type="dxa" w:w="4320"/>
+          </w:tcPr>
+          <w:p>
+            <w:r>
+              <w:t>Markdown sanitization</w:t>
+            </w:r>
+          </w:p>
+        </w:tc>
+      </w:tr>
+      <w:tr>
+        <w:tc>
+          <w:tcPr>
+            <w:tcW w:type="dxa" w:w="4320"/>
+          </w:tcPr>
+          <w:p>
+            <w:r>
+              <w:t>localStorage</w:t>
+            </w:r>
+          </w:p>
+        </w:tc>
+        <w:tc>
+          <w:tcPr>
+            <w:tcW w:type="dxa" w:w="4320"/>
+          </w:tcPr>
+          <w:p>
+            <w:r>
+              <w:t>Persistent conversation storage</w:t>
+            </w:r>
+          </w:p>
+        </w:tc>
+      </w:tr>
+      <w:tr>
+        <w:tc>
+          <w:tcPr>
+            <w:tcW w:type="dxa" w:w="4320"/>
+          </w:tcPr>
+          <w:p>
+            <w:r>
+              <w:t>Vitest + React Testing Library</w:t>
             </w:r>
           </w:p>
         </w:tc>
@@ -360,7 +420,7 @@
     </w:p>
     <w:p>
       <w:r>
-        <w:t>The application follows a modular component-based architecture using the Next.js App Router. Frontend UI components are separated into reusable modules, while backend API communication is handled securely through server-side API routes.</w:t>
+        <w:t>The application follows a modular component-based architecture using the Next.js App Router. Frontend functionality is organized into reusable components, hooks, utility functions, and server-side API routes for secure AI communication.</w:t>
       </w:r>
     </w:p>
     <w:p>
@@ -368,7 +428,7 @@
         <w:pStyle w:val="ListBullet"/>
       </w:pPr>
       <w:r>
-        <w:t>Reusable UI components</w:t>
+        <w:t>Reusable component-based UI architecture</w:t>
       </w:r>
     </w:p>
     <w:p>
@@ -376,7 +436,7 @@
         <w:pStyle w:val="ListBullet"/>
       </w:pPr>
       <w:r>
-        <w:t>Centralized API handling</w:t>
+        <w:t>Dedicated custom useChat hook for state management</w:t>
       </w:r>
     </w:p>
     <w:p>
@@ -392,7 +452,7 @@
         <w:pStyle w:val="ListBullet"/>
       </w:pPr>
       <w:r>
-        <w:t>Type-safe development using TypeScript</w:t>
+        <w:t>Secure server-side API communication</w:t>
       </w:r>
     </w:p>
     <w:p>
@@ -400,7 +460,7 @@
         <w:pStyle w:val="ListBullet"/>
       </w:pPr>
       <w:r>
-        <w:t>Persistent state management</w:t>
+        <w:t>Persistent localStorage-based conversation handling</w:t>
       </w:r>
     </w:p>
     <w:p>
@@ -408,7 +468,23 @@
         <w:pStyle w:val="ListBullet"/>
       </w:pPr>
       <w:r>
-        <w:t>Responsive and scalable UI structure</w:t>
+        <w:t>Streaming response handling using SSE</w:t>
+      </w:r>
+    </w:p>
+    <w:p>
+      <w:pPr>
+        <w:pStyle w:val="ListBullet"/>
+      </w:pPr>
+      <w:r>
+        <w:t>JSON fallback support for reliability</w:t>
+      </w:r>
+    </w:p>
+    <w:p>
+      <w:pPr>
+        <w:pStyle w:val="ListBullet"/>
+      </w:pPr>
+      <w:r>
+        <w:t>Responsive design implementation</w:t>
       </w:r>
     </w:p>
     <w:p>
@@ -442,6 +518,8 @@
         <w:br/>
         <w:t>│   ├── hooks/</w:t>
         <w:br/>
+        <w:t>│   ├── lib/</w:t>
+        <w:br/>
         <w:t>│   ├── types/</w:t>
         <w:br/>
         <w:t>│   └── utils/</w:t>
@@ -469,28 +547,154 @@
     <w:p>
       <w:r>
         <w:br/>
-        <w:t>AI_PROVIDER=groq or gemini</w:t>
+        <w:t>AI_PROVIDER=groq</w:t>
         <w:br/>
         <w:br/>
         <w:t>GROQ_API_KEY=your_groq_api_key</w:t>
         <w:br/>
-        <w:t>GROQ_MODEL=groq_model_to_be_used</w:t>
+        <w:t>GROQ_MODEL=llama-3.3-70b-versatile</w:t>
         <w:br/>
         <w:br/>
         <w:t>GEMINI_API_KEY=your_gemini_api_key</w:t>
         <w:br/>
-        <w:t>GEMINI_MODEL=gemini_model_to_be_used</w:t>
+        <w:t>GEMINI_MODEL=gemini-2.5-flash</w:t>
         <w:br/>
       </w:r>
     </w:p>
     <w:p>
       <w:r>
-        <w:t>The application supports both Groq and Gemini AI providers. Gemini is configured as the primary provider, while Groq is used as a fallback provider when Gemini API rate limits or quota limits are reached.</w:t>
+        <w:t>The application supports both Groq and Google Gemini AI providers. The active provider is controlled using the AI_PROVIDER environment variable.</w:t>
+      </w:r>
+    </w:p>
+    <w:tbl>
+      <w:tblPr>
+        <w:tblStyle w:val="TableGrid"/>
+        <w:tblW w:type="auto" w:w="0"/>
+        <w:tblLook w:firstColumn="1" w:firstRow="1" w:lastColumn="0" w:lastRow="0" w:noHBand="0" w:noVBand="1" w:val="04A0"/>
+      </w:tblPr>
+      <w:tblGrid>
+        <w:gridCol w:w="4320"/>
+        <w:gridCol w:w="4320"/>
+      </w:tblGrid>
+      <w:tr>
+        <w:tc>
+          <w:tcPr>
+            <w:tcW w:type="dxa" w:w="4320"/>
+          </w:tcPr>
+          <w:p>
+            <w:r>
+              <w:t>Configuration</w:t>
+            </w:r>
+          </w:p>
+        </w:tc>
+        <w:tc>
+          <w:tcPr>
+            <w:tcW w:type="dxa" w:w="4320"/>
+          </w:tcPr>
+          <w:p>
+            <w:r>
+              <w:t>Primary Provider</w:t>
+            </w:r>
+          </w:p>
+        </w:tc>
+      </w:tr>
+      <w:tr>
+        <w:tc>
+          <w:tcPr>
+            <w:tcW w:type="dxa" w:w="4320"/>
+          </w:tcPr>
+          <w:p>
+            <w:r>
+              <w:t>AI_PROVIDER=groq</w:t>
+            </w:r>
+          </w:p>
+        </w:tc>
+        <w:tc>
+          <w:tcPr>
+            <w:tcW w:type="dxa" w:w="4320"/>
+          </w:tcPr>
+          <w:p>
+            <w:r>
+              <w:t>Groq</w:t>
+            </w:r>
+          </w:p>
+        </w:tc>
+      </w:tr>
+      <w:tr>
+        <w:tc>
+          <w:tcPr>
+            <w:tcW w:type="dxa" w:w="4320"/>
+          </w:tcPr>
+          <w:p>
+            <w:r>
+              <w:t>AI_PROVIDER=gemini</w:t>
+            </w:r>
+          </w:p>
+        </w:tc>
+        <w:tc>
+          <w:tcPr>
+            <w:tcW w:type="dxa" w:w="4320"/>
+          </w:tcPr>
+          <w:p>
+            <w:r>
+              <w:t>Gemini</w:t>
+            </w:r>
+          </w:p>
+        </w:tc>
+      </w:tr>
+      <w:tr>
+        <w:tc>
+          <w:tcPr>
+            <w:tcW w:type="dxa" w:w="4320"/>
+          </w:tcPr>
+          <w:p>
+            <w:r>
+              <w:t>Both keys configured without AI_PROVIDER</w:t>
+            </w:r>
+          </w:p>
+        </w:tc>
+        <w:tc>
+          <w:tcPr>
+            <w:tcW w:type="dxa" w:w="4320"/>
+          </w:tcPr>
+          <w:p>
+            <w:r>
+              <w:t>Gemini</w:t>
+            </w:r>
+          </w:p>
+        </w:tc>
+      </w:tr>
+      <w:tr>
+        <w:tc>
+          <w:tcPr>
+            <w:tcW w:type="dxa" w:w="4320"/>
+          </w:tcPr>
+          <w:p>
+            <w:r>
+              <w:t>Only GROQ_API_KEY configured</w:t>
+            </w:r>
+          </w:p>
+        </w:tc>
+        <w:tc>
+          <w:tcPr>
+            <w:tcW w:type="dxa" w:w="4320"/>
+          </w:tcPr>
+          <w:p>
+            <w:r>
+              <w:t>Groq</w:t>
+            </w:r>
+          </w:p>
+        </w:tc>
+      </w:tr>
+    </w:tbl>
+    <w:p>
+      <w:r>
+        <w:t>When Gemini is configured as the primary provider and quota or rate-limit errors occur, the application automatically retries requests using Groq if a Groq API key is available.</w:t>
       </w:r>
     </w:p>
     <w:p>
       <w:r>
-        <w:t>Environment variables are securely managed using server-side configuration to prevent exposure of API credentials in frontend code.</w:t>
+        <w:t>All API keys are securely managed through server-side environment variables and are never exposed to the browser.</w:t>
       </w:r>
     </w:p>
     <w:p>
@@ -498,7 +702,216 @@
         <w:pStyle w:val="Heading2"/>
       </w:pPr>
       <w:r>
-        <w:t>7. Coding Standards and Best Practices</w:t>
+        <w:t>7. Installation and Running the Application</w:t>
+      </w:r>
+    </w:p>
+    <w:p>
+      <w:pPr>
+        <w:pStyle w:val="ListNumber"/>
+      </w:pPr>
+      <w:r>
+        <w:t>Clone the repository from GitHub</w:t>
+      </w:r>
+    </w:p>
+    <w:p>
+      <w:pPr>
+        <w:pStyle w:val="ListNumber"/>
+      </w:pPr>
+      <w:r>
+        <w:t>Navigate to the project directory</w:t>
+      </w:r>
+    </w:p>
+    <w:p>
+      <w:pPr>
+        <w:pStyle w:val="ListNumber"/>
+      </w:pPr>
+      <w:r>
+        <w:t>Install dependencies using npm install</w:t>
+      </w:r>
+    </w:p>
+    <w:p>
+      <w:pPr>
+        <w:pStyle w:val="ListNumber"/>
+      </w:pPr>
+      <w:r>
+        <w:t>Configure environment variables using .env.local</w:t>
+      </w:r>
+    </w:p>
+    <w:p>
+      <w:pPr>
+        <w:pStyle w:val="ListNumber"/>
+      </w:pPr>
+      <w:r>
+        <w:t>Start the development server using npm run dev</w:t>
+      </w:r>
+    </w:p>
+    <w:tbl>
+      <w:tblPr>
+        <w:tblStyle w:val="TableGrid"/>
+        <w:tblW w:type="auto" w:w="0"/>
+        <w:tblLook w:firstColumn="1" w:firstRow="1" w:lastColumn="0" w:lastRow="0" w:noHBand="0" w:noVBand="1" w:val="04A0"/>
+      </w:tblPr>
+      <w:tblGrid>
+        <w:gridCol w:w="4320"/>
+        <w:gridCol w:w="4320"/>
+      </w:tblGrid>
+      <w:tr>
+        <w:tc>
+          <w:tcPr>
+            <w:tcW w:type="dxa" w:w="4320"/>
+          </w:tcPr>
+          <w:p>
+            <w:r>
+              <w:t>Command</w:t>
+            </w:r>
+          </w:p>
+        </w:tc>
+        <w:tc>
+          <w:tcPr>
+            <w:tcW w:type="dxa" w:w="4320"/>
+          </w:tcPr>
+          <w:p>
+            <w:r>
+              <w:t>Description</w:t>
+            </w:r>
+          </w:p>
+        </w:tc>
+      </w:tr>
+      <w:tr>
+        <w:tc>
+          <w:tcPr>
+            <w:tcW w:type="dxa" w:w="4320"/>
+          </w:tcPr>
+          <w:p>
+            <w:r>
+              <w:t>npm run dev</w:t>
+            </w:r>
+          </w:p>
+        </w:tc>
+        <w:tc>
+          <w:tcPr>
+            <w:tcW w:type="dxa" w:w="4320"/>
+          </w:tcPr>
+          <w:p>
+            <w:r>
+              <w:t>Start development server</w:t>
+            </w:r>
+          </w:p>
+        </w:tc>
+      </w:tr>
+      <w:tr>
+        <w:tc>
+          <w:tcPr>
+            <w:tcW w:type="dxa" w:w="4320"/>
+          </w:tcPr>
+          <w:p>
+            <w:r>
+              <w:t>npm run build</w:t>
+            </w:r>
+          </w:p>
+        </w:tc>
+        <w:tc>
+          <w:tcPr>
+            <w:tcW w:type="dxa" w:w="4320"/>
+          </w:tcPr>
+          <w:p>
+            <w:r>
+              <w:t>Create production build</w:t>
+            </w:r>
+          </w:p>
+        </w:tc>
+      </w:tr>
+      <w:tr>
+        <w:tc>
+          <w:tcPr>
+            <w:tcW w:type="dxa" w:w="4320"/>
+          </w:tcPr>
+          <w:p>
+            <w:r>
+              <w:t>npm run start</w:t>
+            </w:r>
+          </w:p>
+        </w:tc>
+        <w:tc>
+          <w:tcPr>
+            <w:tcW w:type="dxa" w:w="4320"/>
+          </w:tcPr>
+          <w:p>
+            <w:r>
+              <w:t>Run production build</w:t>
+            </w:r>
+          </w:p>
+        </w:tc>
+      </w:tr>
+      <w:tr>
+        <w:tc>
+          <w:tcPr>
+            <w:tcW w:type="dxa" w:w="4320"/>
+          </w:tcPr>
+          <w:p>
+            <w:r>
+              <w:t>npm run lint</w:t>
+            </w:r>
+          </w:p>
+        </w:tc>
+        <w:tc>
+          <w:tcPr>
+            <w:tcW w:type="dxa" w:w="4320"/>
+          </w:tcPr>
+          <w:p>
+            <w:r>
+              <w:t>Run ESLint</w:t>
+            </w:r>
+          </w:p>
+        </w:tc>
+      </w:tr>
+      <w:tr>
+        <w:tc>
+          <w:tcPr>
+            <w:tcW w:type="dxa" w:w="4320"/>
+          </w:tcPr>
+          <w:p>
+            <w:r>
+              <w:t>npm run test</w:t>
+            </w:r>
+          </w:p>
+        </w:tc>
+        <w:tc>
+          <w:tcPr>
+            <w:tcW w:type="dxa" w:w="4320"/>
+          </w:tcPr>
+          <w:p>
+            <w:r>
+              <w:t>Run unit tests</w:t>
+            </w:r>
+          </w:p>
+        </w:tc>
+      </w:tr>
+    </w:tbl>
+    <w:p>
+      <w:pPr>
+        <w:pStyle w:val="Heading2"/>
+      </w:pPr>
+      <w:r>
+        <w:t>8. Deployment</w:t>
+      </w:r>
+    </w:p>
+    <w:p>
+      <w:r>
+        <w:t>The application is configured for deployment on Vercel. Environment variables configured in .env.local should also be added to the Vercel project environment settings before deployment.</w:t>
+      </w:r>
+    </w:p>
+    <w:p>
+      <w:r>
+        <w:t>Live Demo: https://ai-chat-assist-mu.vercel.app</w:t>
+      </w:r>
+    </w:p>
+    <w:p>
+      <w:pPr>
+        <w:pStyle w:val="Heading2"/>
+      </w:pPr>
+      <w:r>
+        <w:t>9. Coding Standards and Best Practices</w:t>
       </w:r>
     </w:p>
     <w:p>
@@ -514,7 +927,7 @@
         <w:pStyle w:val="ListBullet"/>
       </w:pPr>
       <w:r>
-        <w:t>Reusable and maintainable code structure</w:t>
+        <w:t>TypeScript-based type safety</w:t>
       </w:r>
     </w:p>
     <w:p>
@@ -522,7 +935,7 @@
         <w:pStyle w:val="ListBullet"/>
       </w:pPr>
       <w:r>
-        <w:t>Type-safe development using TypeScript</w:t>
+        <w:t>Reusable and maintainable code structure</w:t>
       </w:r>
     </w:p>
     <w:p>
@@ -538,7 +951,7 @@
         <w:pStyle w:val="ListBullet"/>
       </w:pPr>
       <w:r>
-        <w:t>Responsive design principles</w:t>
+        <w:t>Responsive Tailwind CSS layout</w:t>
       </w:r>
     </w:p>
     <w:p>
@@ -546,7 +959,7 @@
         <w:pStyle w:val="ListBullet"/>
       </w:pPr>
       <w:r>
-        <w:t>Secure environment variable handling</w:t>
+        <w:t>Secure API handling through server-side routes</w:t>
       </w:r>
     </w:p>
     <w:p>
@@ -554,7 +967,7 @@
         <w:pStyle w:val="ListBullet"/>
       </w:pPr>
       <w:r>
-        <w:t>Consistent naming conventions</w:t>
+        <w:t>Environment variable protection</w:t>
       </w:r>
     </w:p>
     <w:p>
@@ -562,7 +975,7 @@
         <w:pStyle w:val="ListBullet"/>
       </w:pPr>
       <w:r>
-        <w:t>Proper loading and error state management</w:t>
+        <w:t>Input validation and user-facing error handling</w:t>
       </w:r>
     </w:p>
     <w:p>
@@ -570,7 +983,7 @@
         <w:pStyle w:val="ListBullet"/>
       </w:pPr>
       <w:r>
-        <w:t>Code modularization and separation of concerns</w:t>
+        <w:t>Streaming response implementation with fallback handling</w:t>
       </w:r>
     </w:p>
     <w:p>
@@ -578,7 +991,15 @@
         <w:pStyle w:val="ListBullet"/>
       </w:pPr>
       <w:r>
-        <w:t>Unit testing support</w:t>
+        <w:t>Sanitized markdown rendering</w:t>
+      </w:r>
+    </w:p>
+    <w:p>
+      <w:pPr>
+        <w:pStyle w:val="ListBullet"/>
+      </w:pPr>
+      <w:r>
+        <w:t>Unit testing implementation</w:t>
       </w:r>
     </w:p>
     <w:p>
@@ -586,12 +1007,7 @@
         <w:pStyle w:val="Heading2"/>
       </w:pPr>
       <w:r>
-        <w:t>8. Testing and Validation</w:t>
-      </w:r>
-    </w:p>
-    <w:p>
-      <w:r>
-        <w:t>The application includes unit testing support to validate component behavior and ensure application stability. The project also supports linting and production build validation.</w:t>
+        <w:t>10. Future Enhancements</w:t>
       </w:r>
     </w:p>
     <w:p>
@@ -599,39 +1015,7 @@
         <w:pStyle w:val="ListBullet"/>
       </w:pPr>
       <w:r>
-        <w:t>npm run test</w:t>
-      </w:r>
-    </w:p>
-    <w:p>
-      <w:pPr>
-        <w:pStyle w:val="ListBullet"/>
-      </w:pPr>
-      <w:r>
-        <w:t>npm run lint</w:t>
-      </w:r>
-    </w:p>
-    <w:p>
-      <w:pPr>
-        <w:pStyle w:val="ListBullet"/>
-      </w:pPr>
-      <w:r>
-        <w:t>npm run build</w:t>
-      </w:r>
-    </w:p>
-    <w:p>
-      <w:pPr>
-        <w:pStyle w:val="Heading2"/>
-      </w:pPr>
-      <w:r>
-        <w:t>9. Future Enhancements</w:t>
-      </w:r>
-    </w:p>
-    <w:p>
-      <w:pPr>
-        <w:pStyle w:val="ListBullet"/>
-      </w:pPr>
-      <w:r>
-        <w:t>Authentication and user account support</w:t>
+        <w:t>User authentication support</w:t>
       </w:r>
     </w:p>
     <w:p>
@@ -647,7 +1031,7 @@
         <w:pStyle w:val="ListBullet"/>
       </w:pPr>
       <w:r>
-        <w:t>Advanced accessibility improvements</w:t>
+        <w:t>Request cancellation while streaming</w:t>
       </w:r>
     </w:p>
     <w:p>
@@ -655,7 +1039,7 @@
         <w:pStyle w:val="ListBullet"/>
       </w:pPr>
       <w:r>
-        <w:t>Cloud database integration</w:t>
+        <w:t>Improved accessibility enhancements</w:t>
       </w:r>
     </w:p>
     <w:p>
@@ -663,7 +1047,7 @@
         <w:pStyle w:val="ListBullet"/>
       </w:pPr>
       <w:r>
-        <w:t>Multi-model AI selection interface</w:t>
+        <w:t>Cloud database synchronization</w:t>
       </w:r>
     </w:p>
     <w:p>
@@ -671,7 +1055,7 @@
         <w:pStyle w:val="ListBullet"/>
       </w:pPr>
       <w:r>
-        <w:t>Enhanced streaming optimization</w:t>
+        <w:t>Dark/light theme toggle</w:t>
       </w:r>
     </w:p>
     <w:p>
@@ -679,12 +1063,12 @@
         <w:pStyle w:val="Heading2"/>
       </w:pPr>
       <w:r>
-        <w:t>10. Conclusion</w:t>
+        <w:t>11. Conclusion</w:t>
       </w:r>
     </w:p>
     <w:p>
       <w:r>
-        <w:t>AI Chat Assist demonstrates modern frontend engineering practices through the implementation of scalable architecture, reusable components, AI integrations, responsive design, and robust state management. The project emphasizes maintainability, user experience, and production-oriented development standards.</w:t>
+        <w:t>AI Chat Assist demonstrates modern frontend engineering practices through scalable architecture, streaming AI integrations, reusable components, secure API handling, responsive UI design, and robust state management. The project emphasizes maintainability, reliability, and production-oriented development standards.</w:t>
       </w:r>
     </w:p>
     <w:sectPr>

</xml_diff>